<commit_message>
Templates: Revisao PGFN decadencia e EPE prescricao intercorrente; tratamento do procurador nos 5 modelos
Co-Authored-By: Claude Sonnet 5.5 <noreply@anthropic.com>
</commit_message>
<xml_diff>
--- a/templates/pecas/EPE_decadencia.docx
+++ b/templates/pecas/EPE_decadencia.docx
@@ -182,7 +182,7 @@
           <w:rFonts w:ascii="Quattrocento Sans" w:cs="Quattrocento Sans" w:eastAsia="Quattrocento Sans" w:hAnsi="Quattrocento Sans"/>
           <w:rtl w:val="0"/>
         </w:rPr>
-        <w:t xml:space="preserve">já devidamente qualificada nos presentes autos, por intermédio de sua advogada que esta subscreve, constituída mediante instrumento de mandato anexo, vem, respeitosamente a Vossa Excelência, opor a presente </w:t>
+        <w:t xml:space="preserve">já devidamente qualificada nos presentes autos, por intermédio de +++INS tratamento_procurador+++ que esta +++INS subscreve_concord+++, +++INS constituido_concord+++ mediante instrumento de mandato anexo, vem, respeitosamente a Vossa Excelência, opor a presente </w:t>
       </w:r>
     </w:p>
     <w:p>
@@ -3166,15 +3166,13 @@
           <w:rFonts w:ascii="Quattrocento Sans" w:cs="Quattrocento Sans" w:eastAsia="Quattrocento Sans" w:hAnsi="Quattrocento Sans"/>
           <w:b w:val="1"/>
           <w:bCs w:val="1"/>
-          <w:color w:val="ffffff"/>
-        </w:rPr>
-      </w:pPr>
-      <w:r>
-        <w:rPr>
-          <w:rFonts w:ascii="Quattrocento Sans" w:cs="Quattrocento Sans" w:eastAsia="Quattrocento Sans" w:hAnsi="Quattrocento Sans"/>
-          <w:b w:val="1"/>
-          <w:bCs w:val="1"/>
-          <w:color w:val="ffffff"/>
+        </w:rPr>
+      </w:pPr>
+      <w:r>
+        <w:rPr>
+          <w:rFonts w:ascii="Quattrocento Sans" w:cs="Quattrocento Sans" w:eastAsia="Quattrocento Sans" w:hAnsi="Quattrocento Sans"/>
+          <w:b w:val="1"/>
+          <w:bCs w:val="1"/>
           <w:rtl w:val="0"/>
         </w:rPr>
         <w:t xml:space="preserve">+++INS $a.nome+++ | +++INS $a.oab+++</w:t>

</xml_diff>